<commit_message>
Update progress report and add demo export
Co-Authored-By: Claude Opus 5.5 <noreply@anthropic.com>
</commit_message>
<xml_diff>
--- a/report/Report_tien_do_Do_an_CO5103_VoVanDung.docx
+++ b/report/Report_tien_do_Do_an_CO5103_VoVanDung.docx
@@ -2999,6 +2999,7 @@
         <w:keepNext/>
       </w:pPr>
       <w:r>
+        <w:lastRenderedPageBreak/>
         <w:fldChar w:fldCharType="end"/>
       </w:r>
     </w:p>
@@ -3023,7 +3024,6 @@
       </w:pPr>
       <w:bookmarkStart w:id="1" w:name="_Toc241960458"/>
       <w:r>
-        <w:lastRenderedPageBreak/>
         <w:t>1.1. Thực trạng</w:t>
       </w:r>
       <w:bookmarkEnd w:id="1"/>
@@ -3235,6 +3235,7 @@
           <w:b/>
           <w:bCs/>
         </w:rPr>
+        <w:lastRenderedPageBreak/>
         <w:t>Giao hàng cho khách nước ngoài đòi hỏi độ tin cậy cao.</w:t>
       </w:r>
       <w:r>
@@ -3522,6 +3523,7 @@
           <w:b/>
           <w:bCs/>
         </w:rPr>
+        <w:lastRenderedPageBreak/>
         <w:t>Lập kế hoạch</w:t>
       </w:r>
       <w:r>
@@ -3951,6 +3953,7 @@
       </w:pPr>
       <w:bookmarkStart w:id="6" w:name="_Toc241960462"/>
       <w:r>
+        <w:lastRenderedPageBreak/>
         <w:t>2. Cơ sở lý thuyết</w:t>
       </w:r>
       <w:bookmarkEnd w:id="6"/>
@@ -4570,6 +4573,7 @@
           <w:b/>
           <w:bCs/>
         </w:rPr>
+        <w:lastRenderedPageBreak/>
         <w:t>Tối ưu Pareto:</w:t>
       </w:r>
       <w:r>
@@ -5553,6 +5557,7 @@
       </w:pPr>
       <w:bookmarkStart w:id="11" w:name="_Toc241960467"/>
       <w:r>
+        <w:lastRenderedPageBreak/>
         <w:t>2.5. Tái lập lịch và diễn giải</w:t>
       </w:r>
       <w:bookmarkEnd w:id="11"/>
@@ -5760,6 +5765,7 @@
       </w:pPr>
       <w:bookmarkStart w:id="12" w:name="_Toc241960468"/>
       <w:r>
+        <w:lastRenderedPageBreak/>
         <w:t>3. Các nghiên cứu liên quan</w:t>
       </w:r>
       <w:bookmarkEnd w:id="12"/>
@@ -6015,6 +6021,7 @@
       </w:pPr>
       <w:bookmarkStart w:id="14" w:name="_Toc241960470"/>
       <w:r>
+        <w:lastRenderedPageBreak/>
         <w:t>3.2. Bảng đối sánh</w:t>
       </w:r>
       <w:bookmarkEnd w:id="14"/>
@@ -8681,6 +8688,7 @@
                 <w:sz w:val="17"/>
                 <w:szCs w:val="17"/>
               </w:rPr>
+              <w:lastRenderedPageBreak/>
               <w:t>Nguyễn Hồng Phúc et al. 2026 (TNU JST)</w:t>
             </w:r>
             <w:r>
@@ -10492,6 +10500,7 @@
         <w:jc w:val="both"/>
       </w:pPr>
       <w:r>
+        <w:lastRenderedPageBreak/>
         <w:t>Các bộ benchmark công khai chỉ kiểm tra được phần lõi job-shop. Không bộ nào có đủ ca làm việc, khuôn dùng chung, tồn bán thành phẩm và giao hàng theo đơn. Vì vậy đề tài tự xây thêm dữ liệu nghiệp vụ (Mục 5.2).</w:t>
       </w:r>
     </w:p>
@@ -10626,6 +10635,7 @@
       </w:pPr>
       <w:bookmarkStart w:id="17" w:name="_Toc241960473"/>
       <w:r>
+        <w:lastRenderedPageBreak/>
         <w:t>4. Giải pháp đề xuất: lập lịch kết hợp nhiều thuật toán, người lập kế hoạch chọn</w:t>
       </w:r>
       <w:bookmarkEnd w:id="17"/>
@@ -11144,6 +11154,7 @@
                 <w:sz w:val="19"/>
                 <w:szCs w:val="19"/>
               </w:rPr>
+              <w:lastRenderedPageBreak/>
               <w:t>Khuôn dùng chung và bảo trì</w:t>
             </w:r>
           </w:p>
@@ -12338,6 +12349,7 @@
         <w:jc w:val="both"/>
       </w:pPr>
       <w:r>
+        <w:lastRenderedPageBreak/>
         <w:t>Bộ kiểm tra không tin các cờ "hợp lệ" do thuật toán tự báo. Kèm 64 kiểm thử tự động, trong đó có các lịch cố tình làm sai để bảo đảm bộ kiểm tra phát hiện được lỗi. Đây là điều kiện để giải pháp kết hợp đáng tin: các thuật toán khác nhau được so trên cùng một thước đo.</w:t>
       </w:r>
     </w:p>
@@ -12856,6 +12868,7 @@
         <w:rPr>
           <w:noProof/>
         </w:rPr>
+        <w:lastRenderedPageBreak/>
         <w:drawing>
           <wp:inline distT="0" distB="0" distL="0" distR="0" wp14:anchorId="526107C4" wp14:editId="6F73DAAB">
             <wp:extent cx="6096000" cy="4467225"/>
@@ -12937,6 +12950,7 @@
         <w:rPr>
           <w:noProof/>
         </w:rPr>
+        <w:lastRenderedPageBreak/>
         <w:drawing>
           <wp:inline distT="0" distB="0" distL="0" distR="0" wp14:anchorId="4A98C49C" wp14:editId="61BB837D">
             <wp:extent cx="6096000" cy="5743575"/>
@@ -13018,6 +13032,7 @@
         <w:rPr>
           <w:noProof/>
         </w:rPr>
+        <w:lastRenderedPageBreak/>
         <w:drawing>
           <wp:inline distT="0" distB="0" distL="0" distR="0" wp14:anchorId="71B0450C" wp14:editId="1255DA1E">
             <wp:extent cx="6096000" cy="3762375"/>
@@ -13099,6 +13114,7 @@
         <w:rPr>
           <w:noProof/>
         </w:rPr>
+        <w:lastRenderedPageBreak/>
         <w:drawing>
           <wp:inline distT="0" distB="0" distL="0" distR="0" wp14:anchorId="029D7503" wp14:editId="6D9EABD6">
             <wp:extent cx="6096000" cy="5286375"/>
@@ -13241,7 +13257,11 @@
         <w:jc w:val="both"/>
       </w:pPr>
       <w:r>
-        <w:t>Trong bản demo, nhật ký quyết định mới lưu trong trình duyệt. Trong sản phẩm, quyết định sẽ lưu vào cơ sở dữ liệu cùng kịch bản và người chọn. Bước tiếp theo (B7) là cho phép sửa tay, khoá phần đã chốt rồi để CP-SAT tối ưu lại phần còn lại. Bộ giải đã hỗ trợ cố định một phần lịch; phần giao diện chưa làm.</w:t>
+        <w:t xml:space="preserve">Trong bản demo, nhật ký quyết định mới lưu trong trình duyệt. Trong sản phẩm, quyết định sẽ lưu vào cơ sở dữ liệu cùng kịch bản và người chọn. Bước tiếp theo (B7) là cho phép sửa tay, khoá phần </w:t>
+      </w:r>
+      <w:r>
+        <w:lastRenderedPageBreak/>
+        <w:t>đã chốt rồi để CP-SAT tối ưu lại phần còn lại. Bộ giải đã hỗ trợ cố định một phần lịch; phần giao diện chưa làm.</w:t>
       </w:r>
     </w:p>
     <w:p>
@@ -13333,6 +13353,7 @@
       </w:pPr>
       <w:bookmarkStart w:id="25" w:name="_Toc241960481"/>
       <w:r>
+        <w:lastRenderedPageBreak/>
         <w:t>5. Kết quả đạt được</w:t>
       </w:r>
       <w:bookmarkEnd w:id="25"/>
@@ -14161,27 +14182,13 @@
         <w:jc w:val="both"/>
       </w:pPr>
       <w:r>
-        <w:t xml:space="preserve">Quy trình và phần lớn thông số được rút ra từ việc phân tích một video quy trình sản xuất vành xe máy hợp kim nhôm của một nhà máy thật. Video cho thấy 19 công đoạn, gom thành 6 giai đoạn. Đề tài gộp thành </w:t>
-      </w:r>
-      <w:r>
-        <w:rPr>
-          <w:b/>
-          <w:bCs/>
-        </w:rPr>
-        <w:t>5 công đoạn chính</w:t>
-      </w:r>
-      <w:r>
-        <w:t xml:space="preserve">; các bước phụ do công nhân khác làm song song được cộng vào phần thời gian cố định của mỗi lượt. Những thông số video không thể hiện (thời gian chuyển đổi, nhịp băng tải sơn, chu kỳ bảo trì khuôn) là </w:t>
-      </w:r>
-      <w:r>
-        <w:rPr>
-          <w:b/>
-          <w:bCs/>
-        </w:rPr>
-        <w:t>ước tính</w:t>
-      </w:r>
-      <w:r>
-        <w:t xml:space="preserve"> và được ghi rõ trong hồ sơ dữ liệu. Thời gian nhiệt luyện 8 giờ/mẻ là giả định tương ứng chu trình nhiệt luyện đã rút ngắn.</w:t>
+        <w:t xml:space="preserve">Quy trình và phần lớn thông số được rút ra từ việc phân tích một video quy trình sản xuất vành xe máy </w:t>
+      </w:r>
+      <w:r>
+        <w:t>hợp kim nhôm của một nhà máy thật. Video cho thấy 19 công đoạn, gom thành 6 giai đoạn. Đề tài gộp thành 5 công đoạn chính; các bước phụ do công nhân khác làm song song được cộng vào phần thời gian cố định của mỗi lượt. Những thông số video không thể hiện (thời gian chuyển đổi, nhịp băng tải sơn, chu kỳ bảo trì khuôn) là ước tính và được ghi rõ trong</w:t>
+      </w:r>
+      <w:r>
+        <w:t xml:space="preserve"> hồ sơ dữ liệu. Thời gian nhiệt luyện 8 giờ/mẻ là giả định tương ứng chu trình nhiệt luyện đã rút ngắn.</w:t>
       </w:r>
     </w:p>
     <w:p>
@@ -15073,6 +15080,7 @@
           <w:b/>
           <w:bCs/>
         </w:rPr>
+        <w:lastRenderedPageBreak/>
         <w:t>Sản phẩm, kho và đơn hàng</w:t>
       </w:r>
     </w:p>
@@ -15188,8 +15196,8 @@
         <w:tblLook w:val="04A0" w:firstRow="1" w:lastRow="0" w:firstColumn="1" w:lastColumn="0" w:noHBand="0" w:noVBand="1"/>
       </w:tblPr>
       <w:tblGrid>
-        <w:gridCol w:w="2786"/>
-        <w:gridCol w:w="2334"/>
+        <w:gridCol w:w="2547"/>
+        <w:gridCol w:w="2573"/>
         <w:gridCol w:w="4518"/>
       </w:tblGrid>
       <w:tr>
@@ -15199,7 +15207,7 @@
         </w:trPr>
         <w:tc>
           <w:tcPr>
-            <w:tcW w:w="2786" w:type="dxa"/>
+            <w:tcW w:w="2547" w:type="dxa"/>
             <w:tcBorders>
               <w:top w:val="single" w:sz="4" w:space="0" w:color="808080"/>
               <w:left w:val="single" w:sz="4" w:space="0" w:color="808080"/>
@@ -15228,7 +15236,7 @@
         </w:tc>
         <w:tc>
           <w:tcPr>
-            <w:tcW w:w="2334" w:type="dxa"/>
+            <w:tcW w:w="2573" w:type="dxa"/>
             <w:tcBorders>
               <w:top w:val="single" w:sz="4" w:space="0" w:color="808080"/>
               <w:left w:val="single" w:sz="4" w:space="0" w:color="808080"/>
@@ -15291,7 +15299,7 @@
         </w:trPr>
         <w:tc>
           <w:tcPr>
-            <w:tcW w:w="2786" w:type="dxa"/>
+            <w:tcW w:w="2547" w:type="dxa"/>
             <w:tcBorders>
               <w:top w:val="single" w:sz="4" w:space="0" w:color="808080"/>
               <w:left w:val="single" w:sz="4" w:space="0" w:color="808080"/>
@@ -15319,7 +15327,7 @@
         </w:tc>
         <w:tc>
           <w:tcPr>
-            <w:tcW w:w="2334" w:type="dxa"/>
+            <w:tcW w:w="2573" w:type="dxa"/>
             <w:tcBorders>
               <w:top w:val="single" w:sz="4" w:space="0" w:color="808080"/>
               <w:left w:val="single" w:sz="4" w:space="0" w:color="808080"/>
@@ -15376,7 +15384,7 @@
         </w:trPr>
         <w:tc>
           <w:tcPr>
-            <w:tcW w:w="2786" w:type="dxa"/>
+            <w:tcW w:w="2547" w:type="dxa"/>
             <w:tcBorders>
               <w:top w:val="single" w:sz="4" w:space="0" w:color="808080"/>
               <w:left w:val="single" w:sz="4" w:space="0" w:color="808080"/>
@@ -15404,7 +15412,7 @@
         </w:tc>
         <w:tc>
           <w:tcPr>
-            <w:tcW w:w="2334" w:type="dxa"/>
+            <w:tcW w:w="2573" w:type="dxa"/>
             <w:tcBorders>
               <w:top w:val="single" w:sz="4" w:space="0" w:color="808080"/>
               <w:left w:val="single" w:sz="4" w:space="0" w:color="808080"/>
@@ -15461,7 +15469,7 @@
         </w:trPr>
         <w:tc>
           <w:tcPr>
-            <w:tcW w:w="2786" w:type="dxa"/>
+            <w:tcW w:w="2547" w:type="dxa"/>
             <w:tcBorders>
               <w:top w:val="single" w:sz="4" w:space="0" w:color="808080"/>
               <w:left w:val="single" w:sz="4" w:space="0" w:color="808080"/>
@@ -15489,7 +15497,7 @@
         </w:tc>
         <w:tc>
           <w:tcPr>
-            <w:tcW w:w="2334" w:type="dxa"/>
+            <w:tcW w:w="2573" w:type="dxa"/>
             <w:tcBorders>
               <w:top w:val="single" w:sz="4" w:space="0" w:color="808080"/>
               <w:left w:val="single" w:sz="4" w:space="0" w:color="808080"/>
@@ -15546,7 +15554,7 @@
         </w:trPr>
         <w:tc>
           <w:tcPr>
-            <w:tcW w:w="2786" w:type="dxa"/>
+            <w:tcW w:w="2547" w:type="dxa"/>
             <w:tcBorders>
               <w:top w:val="single" w:sz="4" w:space="0" w:color="808080"/>
               <w:left w:val="single" w:sz="4" w:space="0" w:color="808080"/>
@@ -15574,7 +15582,7 @@
         </w:tc>
         <w:tc>
           <w:tcPr>
-            <w:tcW w:w="2334" w:type="dxa"/>
+            <w:tcW w:w="2573" w:type="dxa"/>
             <w:tcBorders>
               <w:top w:val="single" w:sz="4" w:space="0" w:color="808080"/>
               <w:left w:val="single" w:sz="4" w:space="0" w:color="808080"/>
@@ -15631,7 +15639,7 @@
         </w:trPr>
         <w:tc>
           <w:tcPr>
-            <w:tcW w:w="2786" w:type="dxa"/>
+            <w:tcW w:w="2547" w:type="dxa"/>
             <w:tcBorders>
               <w:top w:val="single" w:sz="4" w:space="0" w:color="808080"/>
               <w:left w:val="single" w:sz="4" w:space="0" w:color="808080"/>
@@ -15659,7 +15667,7 @@
         </w:tc>
         <w:tc>
           <w:tcPr>
-            <w:tcW w:w="2334" w:type="dxa"/>
+            <w:tcW w:w="2573" w:type="dxa"/>
             <w:tcBorders>
               <w:top w:val="single" w:sz="4" w:space="0" w:color="808080"/>
               <w:left w:val="single" w:sz="4" w:space="0" w:color="808080"/>
@@ -15716,7 +15724,7 @@
         </w:trPr>
         <w:tc>
           <w:tcPr>
-            <w:tcW w:w="2786" w:type="dxa"/>
+            <w:tcW w:w="2547" w:type="dxa"/>
             <w:tcBorders>
               <w:top w:val="single" w:sz="4" w:space="0" w:color="808080"/>
               <w:left w:val="single" w:sz="4" w:space="0" w:color="808080"/>
@@ -15744,7 +15752,7 @@
         </w:tc>
         <w:tc>
           <w:tcPr>
-            <w:tcW w:w="2334" w:type="dxa"/>
+            <w:tcW w:w="2573" w:type="dxa"/>
             <w:tcBorders>
               <w:top w:val="single" w:sz="4" w:space="0" w:color="808080"/>
               <w:left w:val="single" w:sz="4" w:space="0" w:color="808080"/>
@@ -15801,7 +15809,7 @@
         </w:trPr>
         <w:tc>
           <w:tcPr>
-            <w:tcW w:w="2786" w:type="dxa"/>
+            <w:tcW w:w="2547" w:type="dxa"/>
             <w:tcBorders>
               <w:top w:val="single" w:sz="4" w:space="0" w:color="808080"/>
               <w:left w:val="single" w:sz="4" w:space="0" w:color="808080"/>
@@ -15829,7 +15837,7 @@
         </w:tc>
         <w:tc>
           <w:tcPr>
-            <w:tcW w:w="2334" w:type="dxa"/>
+            <w:tcW w:w="2573" w:type="dxa"/>
             <w:tcBorders>
               <w:top w:val="single" w:sz="4" w:space="0" w:color="808080"/>
               <w:left w:val="single" w:sz="4" w:space="0" w:color="808080"/>
@@ -15886,7 +15894,7 @@
         </w:trPr>
         <w:tc>
           <w:tcPr>
-            <w:tcW w:w="2786" w:type="dxa"/>
+            <w:tcW w:w="2547" w:type="dxa"/>
             <w:tcBorders>
               <w:top w:val="single" w:sz="4" w:space="0" w:color="808080"/>
               <w:left w:val="single" w:sz="4" w:space="0" w:color="808080"/>
@@ -15914,7 +15922,7 @@
         </w:tc>
         <w:tc>
           <w:tcPr>
-            <w:tcW w:w="2334" w:type="dxa"/>
+            <w:tcW w:w="2573" w:type="dxa"/>
             <w:tcBorders>
               <w:top w:val="single" w:sz="4" w:space="0" w:color="808080"/>
               <w:left w:val="single" w:sz="4" w:space="0" w:color="808080"/>
@@ -15971,7 +15979,7 @@
         </w:trPr>
         <w:tc>
           <w:tcPr>
-            <w:tcW w:w="2786" w:type="dxa"/>
+            <w:tcW w:w="2547" w:type="dxa"/>
             <w:tcBorders>
               <w:top w:val="single" w:sz="4" w:space="0" w:color="808080"/>
               <w:left w:val="single" w:sz="4" w:space="0" w:color="808080"/>
@@ -15999,7 +16007,7 @@
         </w:tc>
         <w:tc>
           <w:tcPr>
-            <w:tcW w:w="2334" w:type="dxa"/>
+            <w:tcW w:w="2573" w:type="dxa"/>
             <w:tcBorders>
               <w:top w:val="single" w:sz="4" w:space="0" w:color="808080"/>
               <w:left w:val="single" w:sz="4" w:space="0" w:color="808080"/>
@@ -16056,7 +16064,7 @@
         </w:trPr>
         <w:tc>
           <w:tcPr>
-            <w:tcW w:w="2786" w:type="dxa"/>
+            <w:tcW w:w="2547" w:type="dxa"/>
             <w:tcBorders>
               <w:top w:val="single" w:sz="4" w:space="0" w:color="808080"/>
               <w:left w:val="single" w:sz="4" w:space="0" w:color="808080"/>
@@ -16084,7 +16092,7 @@
         </w:tc>
         <w:tc>
           <w:tcPr>
-            <w:tcW w:w="2334" w:type="dxa"/>
+            <w:tcW w:w="2573" w:type="dxa"/>
             <w:tcBorders>
               <w:top w:val="single" w:sz="4" w:space="0" w:color="808080"/>
               <w:left w:val="single" w:sz="4" w:space="0" w:color="808080"/>
@@ -16141,7 +16149,7 @@
         </w:trPr>
         <w:tc>
           <w:tcPr>
-            <w:tcW w:w="2786" w:type="dxa"/>
+            <w:tcW w:w="2547" w:type="dxa"/>
             <w:tcBorders>
               <w:top w:val="single" w:sz="4" w:space="0" w:color="808080"/>
               <w:left w:val="single" w:sz="4" w:space="0" w:color="808080"/>
@@ -16169,7 +16177,7 @@
         </w:tc>
         <w:tc>
           <w:tcPr>
-            <w:tcW w:w="2334" w:type="dxa"/>
+            <w:tcW w:w="2573" w:type="dxa"/>
             <w:tcBorders>
               <w:top w:val="single" w:sz="4" w:space="0" w:color="808080"/>
               <w:left w:val="single" w:sz="4" w:space="0" w:color="808080"/>
@@ -16303,6 +16311,7 @@
         <w:spacing w:after="60" w:line="300" w:lineRule="auto"/>
       </w:pPr>
       <w:r>
+        <w:lastRenderedPageBreak/>
         <w:t>Tồn kho không đủ cho phần đơn được lấy từ kho.</w:t>
       </w:r>
     </w:p>
@@ -18327,7 +18336,11 @@
         <w:t>đây là so giải pháp kết hợp với từng thành phần, không phải so</w:t>
       </w:r>
       <w:r>
-        <w:t xml:space="preserve"> công bằng từng thuật toán. Chưa phương án nào được chứng minh tối ưu; ε ≤ 2 là mức thấp nhất đã thử, chưa chứng minh là thấp nhất có thể.</w:t>
+        <w:t xml:space="preserve"> công bằng từng thuật </w:t>
+      </w:r>
+      <w:r>
+        <w:lastRenderedPageBreak/>
+        <w:t>toán. Chưa phương án nào được chứng minh tối ưu; ε ≤ 2 là mức thấp nhất đã thử, chưa chứng minh là thấp nhất có thể.</w:t>
       </w:r>
     </w:p>
     <w:p>
@@ -20310,6 +20323,7 @@
                 <w:sz w:val="19"/>
                 <w:szCs w:val="19"/>
               </w:rPr>
+              <w:lastRenderedPageBreak/>
               <w:t>Diễn giải lịch (phụ trợ)</w:t>
             </w:r>
           </w:p>
@@ -20568,7 +20582,13 @@
         <w:spacing w:after="60" w:line="300" w:lineRule="auto"/>
       </w:pPr>
       <w:r>
-        <w:t>Chạy lõi CP-SAT và luật điều độ trên Taillard và Lawrence, so với lời giải tốt nhất đã công bố (sai lệch tương đối RPD).</w:t>
+        <w:t xml:space="preserve">Chạy lõi CP-SAT và luật </w:t>
+      </w:r>
+      <w:r>
+        <w:t>dispatching</w:t>
+      </w:r>
+      <w:r>
+        <w:t xml:space="preserve"> trên Taillard và Lawrence, so với lời giải tốt nhất đã công bố (sai lệch tương đối RPD).</w:t>
       </w:r>
     </w:p>
     <w:p>
@@ -20631,26 +20651,6 @@
       <w:r>
         <w:t>Định nghĩa lại chỉ tiêu hiệu suất sử dụng máy; cài đường găng và phân tích độ nhạy.</w:t>
       </w:r>
-    </w:p>
-    <w:p>
-      <w:pPr>
-        <w:spacing w:after="100" w:line="300" w:lineRule="auto"/>
-        <w:jc w:val="both"/>
-      </w:pPr>
-      <w:r>
-        <w:t>Em kính mong cô góp ý về hướng giải pháp kết hợp (Mục 4) và phạm vi đánh giá trên benchmark công khai.</w:t>
-      </w:r>
-    </w:p>
-    <w:p>
-      <w:pPr>
-        <w:rPr>
-          <w:b/>
-          <w:bCs/>
-          <w:color w:val="000000"/>
-          <w:sz w:val="28"/>
-          <w:szCs w:val="28"/>
-        </w:rPr>
-      </w:pPr>
       <w:r>
         <w:br w:type="page"/>
       </w:r>
@@ -20662,6 +20662,7 @@
       </w:pPr>
       <w:bookmarkStart w:id="33" w:name="_Toc241960489"/>
       <w:r>
+        <w:lastRenderedPageBreak/>
         <w:t>Tài liệu tham khảo</w:t>
       </w:r>
       <w:bookmarkEnd w:id="33"/>
@@ -21058,6 +21059,7 @@
         <w:spacing w:after="60" w:line="300" w:lineRule="auto"/>
       </w:pPr>
       <w:r>
+        <w:lastRenderedPageBreak/>
         <w:t xml:space="preserve">Kelley, J. E., &amp; Walker, M. R. (1959). Critical-path planning and scheduling. In </w:t>
       </w:r>
       <w:r>
@@ -21383,6 +21385,7 @@
         <w:spacing w:after="60" w:line="300" w:lineRule="auto"/>
       </w:pPr>
       <w:r>
+        <w:lastRenderedPageBreak/>
         <w:t xml:space="preserve">Smit, I. G., Zhou, J., Reijnen, R., Wu, Y., Chen, J., Zhang, C., Bukhsh, Z., Zhang, Y., &amp; Nuijten, W. P. M. (2025). Graph neural networks for job shop scheduling problems: A survey. </w:t>
       </w:r>
       <w:r>

</xml_diff>